<commit_message>
docs(T4): document auth and migration gates
</commit_message>
<xml_diff>
--- a/财务中心-T4-服务端同步-DESIGN_DOC.docx
+++ b/财务中心-T4-服务端同步-DESIGN_DOC.docx
@@ -28,7 +28,7 @@
         </w:p>
       </w:sdtContent>
     </w:sdt>
-    <w:bookmarkStart w:id="15" w:name="财务中心-t4-服务端同步设计"/>
+    <w:bookmarkStart w:id="15" w:name="财务中心-t4-服务端同步设计v2"/>
     <w:p>
       <w:pPr>
         <w:pStyle w:val="Heading1"/>
@@ -46,7 +46,7 @@
         <w:rPr>
           <w:rFonts w:hint="eastAsia"/>
         </w:rPr>
-        <w:t xml:space="preserve">服务端同步设计</w:t>
+        <w:t xml:space="preserve">服务端同步设计（v2）</w:t>
       </w:r>
     </w:p>
     <w:bookmarkStart w:id="9" w:name="目标"/>
@@ -123,7 +123,16 @@
         <w:rPr>
           <w:rFonts w:hint="eastAsia"/>
         </w:rPr>
-        <w:t xml:space="preserve">在同一主体、月份和渠道下可见。</w:t>
+        <w:t xml:space="preserve">在同一财务工作区、月份和渠道下可见。T4</w:t>
+      </w:r>
+      <w:r>
+        <w:t xml:space="preserve"> </w:t>
+      </w:r>
+      <w:r>
+        <w:rPr>
+          <w:rFonts w:hint="eastAsia"/>
+        </w:rPr>
+        <w:t xml:space="preserve">原有报表是跨渠道汇总口径，因此第一版不把顶栏主体选择器误当成数据库隔离边界。</w:t>
       </w:r>
     </w:p>
     <w:bookmarkEnd w:id="9"/>
@@ -187,7 +196,7 @@
         <w:rPr>
           <w:rFonts w:hint="eastAsia"/>
         </w:rPr>
-        <w:t xml:space="preserve">读取、整月保存、并发版本号</w:t>
+        <w:t xml:space="preserve">读取、整工作区保存、并发版本号和字段级冲突</w:t>
       </w:r>
     </w:p>
     <w:p>
@@ -202,7 +211,43 @@
         <w:rPr>
           <w:rFonts w:hint="eastAsia"/>
         </w:rPr>
-        <w:t xml:space="preserve">旧浏览器数据一次性导入</w:t>
+        <w:t xml:space="preserve">旧浏览器数据备份、预览后显式导入</w:t>
+      </w:r>
+    </w:p>
+    <w:p>
+      <w:pPr>
+        <w:pStyle w:val="Compact"/>
+        <w:numPr>
+          <w:ilvl w:val="0"/>
+          <w:numId w:val="1001"/>
+        </w:numPr>
+      </w:pPr>
+      <w:r>
+        <w:rPr>
+          <w:rFonts w:hint="eastAsia"/>
+        </w:rPr>
+        <w:t xml:space="preserve">门户</w:t>
+      </w:r>
+      <w:r>
+        <w:t xml:space="preserve"> auth_code </w:t>
+      </w:r>
+      <w:r>
+        <w:rPr>
+          <w:rFonts w:hint="eastAsia"/>
+        </w:rPr>
+        <w:t xml:space="preserve">回验建立</w:t>
+      </w:r>
+      <w:r>
+        <w:t xml:space="preserve"> HttpOnly </w:t>
+      </w:r>
+      <w:r>
+        <w:rPr>
+          <w:rFonts w:hint="eastAsia"/>
+        </w:rPr>
+        <w:t xml:space="preserve">会话；未配置时</w:t>
+      </w:r>
+      <w:r>
+        <w:t xml:space="preserve"> fail-closed</w:t>
       </w:r>
     </w:p>
     <w:p>
@@ -213,16 +258,7 @@
         <w:rPr>
           <w:rFonts w:hint="eastAsia"/>
         </w:rPr>
-        <w:t xml:space="preserve">不在本批：统一</w:t>
-      </w:r>
-      <w:r>
-        <w:t xml:space="preserve"> </w:t>
-      </w:r>
-      <w:r>
-        <w:rPr>
-          <w:rFonts w:hint="eastAsia"/>
-        </w:rPr>
-        <w:t xml:space="preserve">SSO、细粒度角色权限、其他项目迁移。</w:t>
+        <w:t xml:space="preserve">不在本批：自动扩大门户访问范围、其他项目迁移。门户权限范围必须先由业务确认。</w:t>
       </w:r>
     </w:p>
     <w:bookmarkEnd w:id="10"/>
@@ -243,13 +279,28 @@
         <w:pStyle w:val="FirstParagraph"/>
       </w:pPr>
       <w:r>
-        <w:t xml:space="preserve">Nginx </w:t>
-      </w:r>
-      <w:r>
-        <w:rPr>
-          <w:rFonts w:hint="eastAsia"/>
-        </w:rPr>
-        <w:t xml:space="preserve">继续提供静态页面；新增独立</w:t>
+        <w:rPr>
+          <w:rFonts w:hint="eastAsia"/>
+        </w:rPr>
+        <w:t xml:space="preserve">静态服务器继续提供页面，并将</w:t>
+      </w:r>
+      <w:r>
+        <w:t xml:space="preserve"> </w:t>
+      </w:r>
+      <w:r>
+        <w:rPr>
+          <w:rStyle w:val="VerbatimChar"/>
+        </w:rPr>
+        <w:t xml:space="preserve">/api/t4/workspace</w:t>
+      </w:r>
+      <w:r>
+        <w:t xml:space="preserve"> </w:t>
+      </w:r>
+      <w:r>
+        <w:rPr>
+          <w:rFonts w:hint="eastAsia"/>
+        </w:rPr>
+        <w:t xml:space="preserve">反代到独立</w:t>
       </w:r>
       <w:r>
         <w:t xml:space="preserve"> Python </w:t>
@@ -261,13 +312,13 @@
         <w:t xml:space="preserve">标准库</w:t>
       </w:r>
       <w:r>
-        <w:t xml:space="preserve"> API </w:t>
-      </w:r>
-      <w:r>
-        <w:rPr>
-          <w:rFonts w:hint="eastAsia"/>
-        </w:rPr>
-        <w:t xml:space="preserve">容器和持久化</w:t>
+        <w:t xml:space="preserve"> API。API </w:t>
+      </w:r>
+      <w:r>
+        <w:rPr>
+          <w:rFonts w:hint="eastAsia"/>
+        </w:rPr>
+        <w:t xml:space="preserve">使用独立</w:t>
       </w:r>
       <w:r>
         <w:t xml:space="preserve"> SQLite </w:t>
@@ -276,61 +327,10 @@
         <w:rPr>
           <w:rFonts w:hint="eastAsia"/>
         </w:rPr>
-        <w:t xml:space="preserve">文件。Nginx</w:t>
-      </w:r>
-      <w:r>
-        <w:t xml:space="preserve"> </w:t>
-      </w:r>
-      <w:r>
-        <w:rPr>
-          <w:rFonts w:hint="eastAsia"/>
-        </w:rPr>
-        <w:t xml:space="preserve">将</w:t>
-      </w:r>
-      <w:r>
-        <w:t xml:space="preserve"> </w:t>
-      </w:r>
-      <w:r>
-        <w:rPr>
-          <w:rStyle w:val="VerbatimChar"/>
-        </w:rPr>
-        <w:t xml:space="preserve">/api/t4/data</w:t>
-      </w:r>
-      <w:r>
-        <w:t xml:space="preserve"> </w:t>
-      </w:r>
-      <w:r>
-        <w:rPr>
-          <w:rFonts w:hint="eastAsia"/>
-        </w:rPr>
-        <w:t xml:space="preserve">反代到</w:t>
-      </w:r>
-      <w:r>
-        <w:t xml:space="preserve"> API </w:t>
-      </w:r>
-      <w:r>
-        <w:rPr>
-          <w:rFonts w:hint="eastAsia"/>
-        </w:rPr>
-        <w:t xml:space="preserve">容器。API</w:t>
-      </w:r>
-      <w:r>
-        <w:t xml:space="preserve"> </w:t>
-      </w:r>
-      <w:r>
-        <w:rPr>
-          <w:rFonts w:hint="eastAsia"/>
-        </w:rPr>
-        <w:t xml:space="preserve">只接受同源</w:t>
-      </w:r>
-      <w:r>
-        <w:t xml:space="preserve"> </w:t>
-      </w:r>
-      <w:r>
-        <w:rPr>
-          <w:rFonts w:hint="eastAsia"/>
-        </w:rPr>
-        <w:t xml:space="preserve">JSON，不接触其他项目数据库。</w:t>
+        <w:t xml:space="preserve">文件，不接触其他项目数据库。生产默认拒绝匿名请求；隔离测试才显式启用</w:t>
+      </w:r>
+      <w:r>
+        <w:t xml:space="preserve"> test mode。</w:t>
       </w:r>
     </w:p>
     <w:bookmarkEnd w:id="11"/>
@@ -358,7 +358,7 @@
         <w:rPr>
           <w:rStyle w:val="VerbatimChar"/>
         </w:rPr>
-        <w:t xml:space="preserve">t4_periods(period, entity_id, data_json, cfg_json, version, updated_at, updated_by)</w:t>
+        <w:t xml:space="preserve">t4_workspaces(workspace, document_json, version, updated_at, updated_by)</w:t>
       </w:r>
     </w:p>
     <w:p>
@@ -371,30 +371,18 @@
       </w:pPr>
       <w:r>
         <w:rPr>
-          <w:rFonts w:hint="eastAsia"/>
-        </w:rPr>
-        <w:t xml:space="preserve">唯一键：</w:t>
-      </w:r>
-      <w:r>
-        <w:rPr>
           <w:rStyle w:val="VerbatimChar"/>
         </w:rPr>
-        <w:t xml:space="preserve">(period, entity_id)</w:t>
-      </w:r>
-      <w:r>
-        <w:rPr>
-          <w:rFonts w:hint="eastAsia"/>
-        </w:rPr>
-        <w:t xml:space="preserve">；第一版主体由前端当前主体</w:t>
-      </w:r>
-      <w:r>
-        <w:t xml:space="preserve"> ID </w:t>
-      </w:r>
-      <w:r>
-        <w:rPr>
-          <w:rFonts w:hint="eastAsia"/>
-        </w:rPr>
-        <w:t xml:space="preserve">传入</w:t>
+        <w:t xml:space="preserve">t4_workspace_revisions</w:t>
+      </w:r>
+      <w:r>
+        <w:t xml:space="preserve"> </w:t>
+      </w:r>
+      <w:r>
+        <w:rPr>
+          <w:rFonts w:hint="eastAsia"/>
+        </w:rPr>
+        <w:t xml:space="preserve">保存每次提交的完整快照，便于恢复</w:t>
       </w:r>
     </w:p>
     <w:p>
@@ -406,10 +394,13 @@
         </w:numPr>
       </w:pPr>
       <w:r>
-        <w:rPr>
-          <w:rFonts w:hint="eastAsia"/>
-        </w:rPr>
-        <w:t xml:space="preserve">更新使用</w:t>
+        <w:t xml:space="preserve">workspace </w:t>
+      </w:r>
+      <w:r>
+        <w:rPr>
+          <w:rFonts w:hint="eastAsia"/>
+        </w:rPr>
+        <w:t xml:space="preserve">固定为</w:t>
       </w:r>
       <w:r>
         <w:t xml:space="preserve"> </w:t>
@@ -418,25 +409,76 @@
         <w:rPr>
           <w:rStyle w:val="VerbatimChar"/>
         </w:rPr>
-        <w:t xml:space="preserve">version</w:t>
+        <w:t xml:space="preserve">finance-t4</w:t>
+      </w:r>
+      <w:r>
+        <w:rPr>
+          <w:rFonts w:hint="eastAsia"/>
+        </w:rPr>
+        <w:t xml:space="preserve">；文档包含</w:t>
       </w:r>
       <w:r>
         <w:t xml:space="preserve"> </w:t>
       </w:r>
       <w:r>
         <w:rPr>
-          <w:rFonts w:hint="eastAsia"/>
-        </w:rPr>
-        <w:t xml:space="preserve">乐观锁，版本不一致返回</w:t>
-      </w:r>
-      <w:r>
-        <w:t xml:space="preserve"> </w:t>
-      </w:r>
-      <w:r>
-        <w:rPr>
-          <w:rFonts w:hint="eastAsia"/>
-        </w:rPr>
-        <w:t xml:space="preserve">409，避免员工互相覆盖</w:t>
+          <w:rStyle w:val="VerbatimChar"/>
+        </w:rPr>
+        <w:t xml:space="preserve">periods</w:t>
+      </w:r>
+      <w:r>
+        <w:t xml:space="preserve">、</w:t>
+      </w:r>
+      <w:r>
+        <w:rPr>
+          <w:rStyle w:val="VerbatimChar"/>
+        </w:rPr>
+        <w:t xml:space="preserve">cfg</w:t>
+      </w:r>
+      <w:r>
+        <w:t xml:space="preserve">、</w:t>
+      </w:r>
+      <w:r>
+        <w:rPr>
+          <w:rStyle w:val="VerbatimChar"/>
+        </w:rPr>
+        <w:t xml:space="preserve">channels</w:t>
+      </w:r>
+    </w:p>
+    <w:p>
+      <w:pPr>
+        <w:pStyle w:val="Compact"/>
+        <w:numPr>
+          <w:ilvl w:val="0"/>
+          <w:numId w:val="1002"/>
+        </w:numPr>
+      </w:pPr>
+      <w:r>
+        <w:rPr>
+          <w:rFonts w:hint="eastAsia"/>
+        </w:rPr>
+        <w:t xml:space="preserve">整文档更新要求精确版本；字段</w:t>
+      </w:r>
+      <w:r>
+        <w:t xml:space="preserve"> patch </w:t>
+      </w:r>
+      <w:r>
+        <w:rPr>
+          <w:rFonts w:hint="eastAsia"/>
+        </w:rPr>
+        <w:t xml:space="preserve">比较</w:t>
+      </w:r>
+      <w:r>
+        <w:t xml:space="preserve"> old </w:t>
+      </w:r>
+      <w:r>
+        <w:rPr>
+          <w:rFonts w:hint="eastAsia"/>
+        </w:rPr>
+        <w:t xml:space="preserve">值，允许不同字段的并发合并，同字段冲突返回</w:t>
+      </w:r>
+      <w:r>
+        <w:t xml:space="preserve"> 409</w:t>
       </w:r>
     </w:p>
     <w:bookmarkEnd w:id="12"/>
@@ -460,7 +502,7 @@
         <w:rPr>
           <w:rFonts w:hint="eastAsia"/>
         </w:rPr>
-        <w:t xml:space="preserve">读取服务端无数据时回退本地数据；保存成功后服务端成为主数据源。本批不删除任何</w:t>
+        <w:t xml:space="preserve">服务端无数据时只在本机保留草稿，不自动覆盖服务端；首次导入必须先备份、预览并由用户确认。本批不删除任何</w:t>
       </w:r>
       <w:r>
         <w:t xml:space="preserve"> </w:t>
@@ -469,7 +511,7 @@
         <w:rPr>
           <w:rFonts w:hint="eastAsia"/>
         </w:rPr>
-        <w:t xml:space="preserve">localStorage。回滚只需停止</w:t>
+        <w:t xml:space="preserve">localStorage。服务端异常时不显示“已保存”，生产回滚可停止</w:t>
       </w:r>
       <w:r>
         <w:t xml:space="preserve"> API </w:t>
@@ -478,7 +520,7 @@
         <w:rPr>
           <w:rFonts w:hint="eastAsia"/>
         </w:rPr>
-        <w:t xml:space="preserve">容器并恢复前端旧逻辑。</w:t>
+        <w:t xml:space="preserve">并恢复旧前端。</w:t>
       </w:r>
     </w:p>
     <w:bookmarkEnd w:id="13"/>
@@ -503,13 +545,22 @@
         </w:numPr>
       </w:pPr>
       <w:r>
-        <w:t xml:space="preserve">API health </w:t>
-      </w:r>
-      <w:r>
-        <w:rPr>
-          <w:rFonts w:hint="eastAsia"/>
-        </w:rPr>
-        <w:t xml:space="preserve">与读写接口</w:t>
+        <w:t xml:space="preserve">API </w:t>
+      </w:r>
+      <w:r>
+        <w:rPr>
+          <w:rFonts w:hint="eastAsia"/>
+        </w:rPr>
+        <w:t xml:space="preserve">health、匿名</w:t>
+      </w:r>
+      <w:r>
+        <w:t xml:space="preserve"> </w:t>
+      </w:r>
+      <w:r>
+        <w:rPr>
+          <w:rFonts w:hint="eastAsia"/>
+        </w:rPr>
+        <w:t xml:space="preserve">401、读写和字段冲突接口</w:t>
       </w:r>
     </w:p>
     <w:p>
@@ -524,7 +575,16 @@
         <w:rPr>
           <w:rFonts w:hint="eastAsia"/>
         </w:rPr>
-        <w:t xml:space="preserve">两个浏览器上下文：A</w:t>
+        <w:t xml:space="preserve">两个不同</w:t>
+      </w:r>
+      <w:r>
+        <w:t xml:space="preserve"> origin </w:t>
+      </w:r>
+      <w:r>
+        <w:rPr>
+          <w:rFonts w:hint="eastAsia"/>
+        </w:rPr>
+        <w:t xml:space="preserve">的真实浏览器：A</w:t>
       </w:r>
       <w:r>
         <w:t xml:space="preserve"> </w:t>
@@ -542,7 +602,16 @@
         <w:rPr>
           <w:rFonts w:hint="eastAsia"/>
         </w:rPr>
-        <w:t xml:space="preserve">刷新可见</w:t>
+        <w:t xml:space="preserve">读取，B</w:t>
+      </w:r>
+      <w:r>
+        <w:t xml:space="preserve"> F5 </w:t>
+      </w:r>
+      <w:r>
+        <w:rPr>
+          <w:rFonts w:hint="eastAsia"/>
+        </w:rPr>
+        <w:t xml:space="preserve">后仍可见</w:t>
       </w:r>
     </w:p>
     <w:p>
@@ -557,10 +626,16 @@
         <w:rPr>
           <w:rFonts w:hint="eastAsia"/>
         </w:rPr>
-        <w:t xml:space="preserve">版本冲突返回</w:t>
-      </w:r>
-      <w:r>
-        <w:t xml:space="preserve"> 409</w:t>
+        <w:t xml:space="preserve">版本冲突和审计</w:t>
+      </w:r>
+      <w:r>
+        <w:t xml:space="preserve"> revision </w:t>
+      </w:r>
+      <w:r>
+        <w:rPr>
+          <w:rFonts w:hint="eastAsia"/>
+        </w:rPr>
+        <w:t xml:space="preserve">单测</w:t>
       </w:r>
     </w:p>
     <w:p>
@@ -572,13 +647,19 @@
         </w:numPr>
       </w:pPr>
       <w:r>
-        <w:t xml:space="preserve">Docker </w:t>
-      </w:r>
-      <w:r>
-        <w:rPr>
-          <w:rFonts w:hint="eastAsia"/>
-        </w:rPr>
-        <w:t xml:space="preserve">重启后数据仍在</w:t>
+        <w:rPr>
+          <w:rFonts w:hint="eastAsia"/>
+        </w:rPr>
+        <w:t xml:space="preserve">生产灰度前完成门户授权码回验、独立卷备份和</w:t>
+      </w:r>
+      <w:r>
+        <w:t xml:space="preserve"> Docker </w:t>
+      </w:r>
+      <w:r>
+        <w:rPr>
+          <w:rFonts w:hint="eastAsia"/>
+        </w:rPr>
+        <w:t xml:space="preserve">重启后数据验证</w:t>
       </w:r>
     </w:p>
     <w:bookmarkEnd w:id="14"/>

</xml_diff>